<commit_message>
DWÓJKA template: fix Wyniki turnieju font + last SUMA borders
Two visual fixes patched directly into DWÓJKA Grupa.docx XML:
1. 'Wyniki turnieju' run had Aptos Narrow → LO without Aptos fell back to a
   serif face. Run rewritten to Calibri (Carlito in production).
2. The rightmost SUMA cell (tbl[1] r2 c13) only had a right border; the
   other three SUMA cells (c4/c7/c10) have top+bottom thick borders. Added
   top sz=12 + bottom sz=4 to c13 so all four match.
</commit_message>
<xml_diff>
--- a/DWÓJKA Grupa.docx
+++ b/DWÓJKA Grupa.docx
@@ -1193,7 +1193,7 @@
             </w:pPr>
             <w:r>
               <w:rPr>
-                <w:rFonts w:ascii="Aptos Narrow" w:eastAsia="Aptos Narrow" w:hAnsi="Aptos Narrow" w:cs="Aptos Narrow"/>
+                <w:rFonts w:ascii="Calibri" w:eastAsia="Calibri" w:hAnsi="Calibri" w:cs="Calibri"/>
                 <w:b/>
                 <w:bCs/>
                 <w:color w:val="000000" w:themeColor="text1"/>
@@ -1793,6 +1793,8 @@
           <w:tcPr>
             <w:tcW w:w="609" w:type="dxa"/>
             <w:tcBorders>
+              <w:top w:val="single" w:sz="12" w:space="0" w:color="auto"/>
+              <w:bottom w:val="single" w:sz="4" w:space="0" w:color="000000" w:themeColor="text1"/>
               <w:right w:val="single" w:sz="12" w:space="0" w:color="auto"/>
             </w:tcBorders>
             <w:shd w:val="clear" w:color="auto" w:fill="FFFFFF" w:themeFill="background1"/>

</xml_diff>